<commit_message>
Identidad visual del Distrito en todos los entregables y modo presentación
- Visor: paleta rojo, vino y oro, Montserrat y Work Sans, encabezado en dos
  niveles, portada con silueta de Bogotá, gráficas legibles en teléfono y
  marcas redondas en la dispersión.
- Modo Presentar (/presentar): las 8 láminas del pitch con gráficas en vivo,
  flechas, cronómetro de 6 minutos y notas del orador (tecla N).
- Figuras con la misma paleta y tipografía (fuentes OFL en assets/fuentes),
  etiquetas sin choques en la dispersión.
- Pitch reconstruido con docs/pitch/construir_pitch.py, notas del orador
  incluidas; nota técnica, formulario y capturas actualizados.
- Power BI recoloreado sin tocar el modelo de datos.
- Notebook reejecutado: mismas cifras.

Co-Authored-By: Claude Opus 5.5 <noreply@anthropic.com>
</commit_message>
<xml_diff>
--- a/docs/Formulario_caracterizacion_The_data_squad.docx
+++ b/docs/Formulario_caracterizacion_The_data_squad.docx
@@ -2479,7 +2479,7 @@
       <w:r>
         <w:drawing>
           <wp:inline xmlns:a="http://schemas.openxmlformats.org/drawingml/2006/main" xmlns:pic="http://schemas.openxmlformats.org/drawingml/2006/picture">
-            <wp:extent cx="4140000" cy="4261765"/>
+            <wp:extent cx="4140000" cy="2875000"/>
             <wp:docPr id="4" name="Picture 4"/>
             <wp:cNvGraphicFramePr>
               <a:graphicFrameLocks noChangeAspect="1"/>
@@ -2488,7 +2488,7 @@
               <a:graphicData uri="http://schemas.openxmlformats.org/drawingml/2006/picture">
                 <pic:pic>
                   <pic:nvPicPr>
-                    <pic:cNvPr id="0" name="form_inicio.png"/>
+                    <pic:cNvPr id="0" name="visor_inicio.png"/>
                     <pic:cNvPicPr/>
                   </pic:nvPicPr>
                   <pic:blipFill>
@@ -2500,7 +2500,7 @@
                   <pic:spPr>
                     <a:xfrm>
                       <a:off x="0" y="0"/>
-                      <a:ext cx="4140000" cy="4261765"/>
+                      <a:ext cx="4140000" cy="2875000"/>
                     </a:xfrm>
                     <a:prstGeom prst="rect"/>
                   </pic:spPr>
@@ -2515,7 +2515,7 @@
       <w:r>
         <w:drawing>
           <wp:inline xmlns:a="http://schemas.openxmlformats.org/drawingml/2006/main" xmlns:pic="http://schemas.openxmlformats.org/drawingml/2006/picture">
-            <wp:extent cx="4140000" cy="3805147"/>
+            <wp:extent cx="4140000" cy="2875000"/>
             <wp:docPr id="3" name="Picture 3"/>
             <wp:cNvGraphicFramePr>
               <a:graphicFrameLocks noChangeAspect="1"/>
@@ -2524,7 +2524,7 @@
               <a:graphicData uri="http://schemas.openxmlformats.org/drawingml/2006/picture">
                 <pic:pic>
                   <pic:nvPicPr>
-                    <pic:cNvPr id="0" name="form_brecha.png"/>
+                    <pic:cNvPr id="0" name="visor_brecha.png"/>
                     <pic:cNvPicPr/>
                   </pic:nvPicPr>
                   <pic:blipFill>
@@ -2536,7 +2536,7 @@
                   <pic:spPr>
                     <a:xfrm>
                       <a:off x="0" y="0"/>
-                      <a:ext cx="4140000" cy="3805147"/>
+                      <a:ext cx="4140000" cy="2875000"/>
                     </a:xfrm>
                     <a:prstGeom prst="rect"/>
                   </pic:spPr>
@@ -2551,7 +2551,7 @@
       <w:r>
         <w:drawing>
           <wp:inline xmlns:a="http://schemas.openxmlformats.org/drawingml/2006/main" xmlns:pic="http://schemas.openxmlformats.org/drawingml/2006/picture">
-            <wp:extent cx="4140000" cy="3500735"/>
+            <wp:extent cx="4140000" cy="2875000"/>
             <wp:docPr id="2" name="Picture 2"/>
             <wp:cNvGraphicFramePr>
               <a:graphicFrameLocks noChangeAspect="1"/>
@@ -2560,7 +2560,7 @@
               <a:graphicData uri="http://schemas.openxmlformats.org/drawingml/2006/picture">
                 <pic:pic>
                   <pic:nvPicPr>
-                    <pic:cNvPr id="0" name="form_que-explica.png"/>
+                    <pic:cNvPr id="0" name="visor_que-explica.png"/>
                     <pic:cNvPicPr/>
                   </pic:nvPicPr>
                   <pic:blipFill>
@@ -2572,7 +2572,7 @@
                   <pic:spPr>
                     <a:xfrm>
                       <a:off x="0" y="0"/>
-                      <a:ext cx="4140000" cy="3500735"/>
+                      <a:ext cx="4140000" cy="2875000"/>
                     </a:xfrm>
                     <a:prstGeom prst="rect"/>
                   </pic:spPr>
@@ -2587,7 +2587,7 @@
       <w:r>
         <w:drawing>
           <wp:inline xmlns:a="http://schemas.openxmlformats.org/drawingml/2006/main" xmlns:pic="http://schemas.openxmlformats.org/drawingml/2006/picture">
-            <wp:extent cx="4140000" cy="4322647"/>
+            <wp:extent cx="4140000" cy="2875000"/>
             <wp:docPr id="1" name="Picture 1"/>
             <wp:cNvGraphicFramePr>
               <a:graphicFrameLocks noChangeAspect="1"/>
@@ -2596,7 +2596,7 @@
               <a:graphicData uri="http://schemas.openxmlformats.org/drawingml/2006/picture">
                 <pic:pic>
                   <pic:nvPicPr>
-                    <pic:cNvPr id="0" name="form_simulador.png"/>
+                    <pic:cNvPr id="0" name="visor_simulador.png"/>
                     <pic:cNvPicPr/>
                   </pic:nvPicPr>
                   <pic:blipFill>
@@ -2608,7 +2608,7 @@
                   <pic:spPr>
                     <a:xfrm>
                       <a:off x="0" y="0"/>
-                      <a:ext cx="4140000" cy="4322647"/>
+                      <a:ext cx="4140000" cy="2875000"/>
                     </a:xfrm>
                     <a:prstGeom prst="rect"/>
                   </pic:spPr>

</xml_diff>

<commit_message>
Entrega final: formulario con H0 y aprendizaje automático, correo y checklist
- Formulario: hipótesis H0 (validar la serie antes de comparar), casilla de
  modelos de IA marcada (aprendizaje supervisado y no supervisado) y el visor
  con la sección Presentar. PDF regenerado.
- Correo de entrega y checklist alineados con los términos de referencia y la
  guía de entrega (un solo correo, plazo 16 oct 11:59 p. m.).

Co-Authored-By: Claude Opus 5.5 <noreply@anthropic.com>
</commit_message>
<xml_diff>
--- a/docs/Formulario_caracterizacion_The_data_squad.docx
+++ b/docs/Formulario_caracterizacion_The_data_squad.docx
@@ -776,6 +776,10 @@
             <w:rPr>
               <w:rFonts w:ascii="Liberation Sans" w:hAnsi="Liberation Sans" w:eastAsia="Liberation Sans" w:cs="Liberation Sans"/>
             </w:rPr>
+            <w:t xml:space="preserve">H0. Antes de comparar percepción y registro, la serie del registro debe ser comparable en el tiempo: se valida contra el registro de la Policía (SIEDCO) y Medicina Legal.</w:t>
+            <w:br/>
+          </w:r>
+          <w:r>
             <w:t xml:space="preserve">H1. La percepción de inseguridad del barrio depende más del entorno inmediato (lo que la persona ve en su cuadra y en su parque) que del delito registrado en su localidad.</w:t>
             <w:br/>
           </w:r>
@@ -2289,7 +2293,7 @@
           </w:rPr>
           <w:id w:val="1897236153"/>
           <w14:checkbox>
-            <w14:checked w14:val="0"/>
+            <w14:checked w14:val="1"/>
             <w14:checkedState w14:val="2612" w14:font="MS Gothic"/>
             <w14:uncheckedState w14:val="2610" w14:font="MS Gothic"/>
           </w14:checkbox>
@@ -2301,7 +2305,7 @@
               <w:b/>
               <w:bCs/>
             </w:rPr>
-            <w:t>☐</w:t>
+            <w:t>☒</w:t>
           </w:r>
         </w:sdtContent>
       </w:sdt>
@@ -2399,7 +2403,7 @@
             <w:rPr>
               <w:rFonts w:ascii="Liberation Sans" w:hAnsi="Liberation Sans" w:eastAsia="Liberation Sans" w:cs="Liberation Sans"/>
             </w:rPr>
-            <w:t xml:space="preserve">Modelos de efectos marginales con bootstrap por conglomerados, validación cruzada predictiva (AUC), índice compuesto con incertidumbre y simulación de escenarios.</w:t>
+            <w:t xml:space="preserve">Validación cruzada del registro contra la Policía y Medicina Legal; binomial negativa de panel para tendencias; efectos marginales con bootstrap por conglomerados; aprendizaje automático supervisado (regresión logística, bosque aleatorio y gradient boosting, con AUC fuera de muestra) y no supervisado (componentes principales y agrupamiento de Ward); índice compuesto con incertidumbre; score de confiabilidad de fuentes y simulación de escenarios.</w:t>
           </w:r>
         </w:sdtContent>
       </w:sdt>
@@ -2470,7 +2474,7 @@
             <w:rPr>
               <w:rFonts w:ascii="Liberation Sans" w:hAnsi="Liberation Sans" w:eastAsia="Liberation Sans" w:cs="Liberation Sans"/>
             </w:rPr>
-            <w:t xml:space="preserve">Visor web «El miedo que no baja» (https://el-miedo-que-no-baja.vercel.app, acceso con la clave enviada en el correo) y tablero de Power BI (carpeta powerbi del repositorio). El visor tiene diez secciones:</w:t>
+            <w:t xml:space="preserve">Visor web «El miedo que no baja» (https://el-miedo-que-no-baja.vercel.app, acceso con la clave enviada en el correo) y tablero de Power BI (carpeta powerbi del repositorio). El visor tiene once secciones:</w:t>
             <w:br/>
           </w:r>
           <w:r>
@@ -2505,7 +2509,7 @@
             <w:rPr>
               <w:rFonts w:ascii="Liberation Sans" w:hAnsi="Liberation Sans" w:eastAsia="Liberation Sans" w:cs="Liberation Sans"/>
             </w:rPr>
-            <w:t xml:space="preserve">5) Género, 6) Tendencia 2018-2026, 7) Simulador de escenarios (alumbrado y parques), 8) Ficha técnica del indicador con línea base, 9) Método (auditoría de datos, flujo de integración, validaciones y limitaciones) y 10) Datos (descargas CSV y GeoJSON para integrar en visores institucionales).</w:t>
+            <w:t xml:space="preserve">5) Género, 6) Tendencia 2018-2026, 7) Simulador de escenarios (alumbrado y parques), 8) Ficha técnica del indicador con línea base, 9) Método (auditoría de datos, flujo de integración, validaciones y limitaciones) y 10) Datos (descargas CSV y GeoJSON para integrar en visores institucionales). 11) Presentar: la sustentación interactiva (validación del registro, los tres modelos, el marcador de ocho hipótesis y las estrategias), con notas y el panel «¿Cómo lo sabemos?».</w:t>
             <w:br/>
           </w:r>
           <w:r>

</xml_diff>

<commit_message>
Contenedor completo de entregables y equipo solo como estudiantes de Ciencia de Datos
- entregables/ en carpetas numeradas: Power BI (.pbix y proyecto PBIP), Python y Colab,
  informe (PDF y Word), nota técnica, formulario, Excel, video con transcripción y pitch
- notebooks/el_miedo_que_no_baja_colab.ipynb: análisis completo para Colab, código sin comentarios
- Equipo sin roles en el visor y en el pitch: "Estudiante de Ciencia de Datos"
- Formulario: perfil "Estudiante de Ciencia de Datos" en cada integrante (PDF regenerado)
- README: estructura con entregables/ y los cuadernos de Colab

Co-Authored-By: Claude Opus 5.5 <noreply@anthropic.com>
</commit_message>
<xml_diff>
--- a/docs/Formulario_caracterizacion_The_data_squad.docx
+++ b/docs/Formulario_caracterizacion_The_data_squad.docx
@@ -301,7 +301,7 @@
             <w:rPr>
               <w:rFonts w:ascii="Liberation Sans" w:hAnsi="Liberation Sans" w:eastAsia="Liberation Sans" w:cs="Liberation Sans"/>
             </w:rPr>
-            <w:t xml:space="preserve">Rafael Estiven Londoño Camacho · Analista de datos · Estudiante</w:t>
+            <w:t xml:space="preserve">Rafael Estiven Londoño Camacho · Analista de datos · Estudiante de Ciencia de Datos</w:t>
           </w:r>
         </w:p>
         <w:p>
@@ -315,7 +315,7 @@
             <w:rPr>
               <w:rFonts w:ascii="Liberation Sans" w:hAnsi="Liberation Sans" w:eastAsia="Liberation Sans" w:cs="Liberation Sans"/>
             </w:rPr>
-            <w:t xml:space="preserve">Brandow Brusly León Rodríguez · Analista de políticas públicas · Estudiante</w:t>
+            <w:t xml:space="preserve">Brandow Brusly León Rodríguez · Analista de políticas públicas · Estudiante de Ciencia de Datos</w:t>
           </w:r>
         </w:p>
         <w:p>
@@ -329,7 +329,7 @@
             <w:rPr>
               <w:rFonts w:ascii="Liberation Sans" w:hAnsi="Liberation Sans" w:eastAsia="Liberation Sans" w:cs="Liberation Sans"/>
             </w:rPr>
-            <w:t xml:space="preserve">Samuel Esteban Riveros Cubides · Experto temático · Estudiante</w:t>
+            <w:t xml:space="preserve">Samuel Esteban Riveros Cubides · Experto temático · Estudiante de Ciencia de Datos</w:t>
           </w:r>
         </w:p>
       </w:sdtContent>

</xml_diff>